<commit_message>
Working frontend and backend with cosmos
</commit_message>
<xml_diff>
--- a/appunti.docx
+++ b/appunti.docx
@@ -656,6 +656,34 @@
     <w:p>
       <w:r>
         <w:t>Con aggiunta che magari consiglia anche un cinema per i film attualmente in produzione</w:t>
+      </w:r>
+    </w:p>
+    <w:p>
+      <w:pPr>
+        <w:pBdr>
+          <w:bottom w:val="single" w:sz="6" w:space="1" w:color="auto"/>
+        </w:pBdr>
+      </w:pPr>
+    </w:p>
+    <w:p/>
+    <w:p>
+      <w:r>
+        <w:t>Creo i connettori del modello</w:t>
+      </w:r>
+    </w:p>
+    <w:p>
+      <w:r>
+        <w:t>Creo un file app.py e uno frontend.py</w:t>
+      </w:r>
+    </w:p>
+    <w:p>
+      <w:r>
+        <w:t>In frontend.py ci faccio streamlit che quando clicco o invio qualcosa fa una chiamata post all’indirizzo di fast api.</w:t>
+      </w:r>
+    </w:p>
+    <w:p>
+      <w:r>
+        <w:t>In app.py metto fastApi e gli dico come deve rispondere.</w:t>
       </w:r>
     </w:p>
     <w:p/>
@@ -1885,6 +1913,7 @@
   <w:style w:type="character" w:default="1" w:styleId="DefaultParagraphFont">
     <w:name w:val="Default Paragraph Font"/>
     <w:uiPriority w:val="1"/>
+    <w:semiHidden/>
     <w:unhideWhenUsed/>
   </w:style>
   <w:style w:type="table" w:default="1" w:styleId="TableNormal">

</xml_diff>